<commit_message>
Ajusta autoria: trabalho individual, curso de Ciencia da Computacao
- Proposta e capa da especificacao com Gabriel Dazilio Fanchiotti como
  unico componente (o template so fixa maximo de 5 alunos, nao ha minimo)
- Curso alterado para Ciencia da Computacao
- Instrucao do mini-mundo trocada para a linha de SI/TADS/CC
- Main usa o nome completo do jogador

Co-Authored-By: Claude Opus 5 <noreply@anthropic.com>
Claude-Session: https://claude.ai/code/session_01EvVSDbZpkBNSqHZQjQs1dc
</commit_message>
<xml_diff>
--- a/docs/trabalhoC1ProjetoOO-Especificacao.docx
+++ b/docs/trabalhoC1ProjetoOO-Especificacao.docx
@@ -25,7 +25,7 @@
           <w:b/>
           <w:sz w:val="26"/>
         </w:rPr>
-        <w:t>CURSO DE GRADUAÇÃO EM SISTEMAS DE INFORMAÇÃO</w:t>
+        <w:t>CURSO DE GRADUAÇÃO EM CIÊNCIA DA COMPUTAÇÃO</w:t>
       </w:r>
     </w:p>
     <w:p>
@@ -50,59 +50,7 @@
           <w:b w:val="0"/>
           <w:sz w:val="24"/>
         </w:rPr>
-        <w:t>GABRIEL FANCHIOTTI</w:t>
-      </w:r>
-    </w:p>
-    <w:p>
-      <w:pPr>
-        <w:spacing w:after="80"/>
-        <w:jc w:val="center"/>
-      </w:pPr>
-      <w:r>
-        <w:rPr>
-          <w:b w:val="0"/>
-          <w:sz w:val="24"/>
-        </w:rPr>
-        <w:t>[NOME DO ALUNO 2]</w:t>
-      </w:r>
-    </w:p>
-    <w:p>
-      <w:pPr>
-        <w:spacing w:after="80"/>
-        <w:jc w:val="center"/>
-      </w:pPr>
-      <w:r>
-        <w:rPr>
-          <w:b w:val="0"/>
-          <w:sz w:val="24"/>
-        </w:rPr>
-        <w:t>[NOME DO ALUNO 3]</w:t>
-      </w:r>
-    </w:p>
-    <w:p>
-      <w:pPr>
-        <w:spacing w:after="80"/>
-        <w:jc w:val="center"/>
-      </w:pPr>
-      <w:r>
-        <w:rPr>
-          <w:b w:val="0"/>
-          <w:sz w:val="24"/>
-        </w:rPr>
-        <w:t>[NOME DO ALUNO 4]</w:t>
-      </w:r>
-    </w:p>
-    <w:p>
-      <w:pPr>
-        <w:spacing w:after="80"/>
-        <w:jc w:val="center"/>
-      </w:pPr>
-      <w:r>
-        <w:rPr>
-          <w:b w:val="0"/>
-          <w:sz w:val="24"/>
-        </w:rPr>
-        <w:t>[NOME DO ALUNO 5]</w:t>
+        <w:t>GABRIEL DAZILIO FANCHIOTTI</w:t>
       </w:r>
     </w:p>
     <w:p>
@@ -299,7 +247,7 @@
               <w:rPr>
                 <w:sz w:val="18"/>
               </w:rPr>
-              <w:t>Gabriel Fanchiotti; [Aluno 2]; [Aluno 3]; [Aluno 4]; [Aluno 5]</w:t>
+              <w:t>Gabriel Dazilio Fanchiotti</w:t>
             </w:r>
           </w:p>
         </w:tc>
@@ -533,7 +481,7 @@
               <w:rPr>
                 <w:sz w:val="18"/>
               </w:rPr>
-              <w:t>Gabriel Fanchiotti</w:t>
+              <w:t>Gabriel Dazilio Fanchiotti</w:t>
             </w:r>
           </w:p>
         </w:tc>
@@ -15106,45 +15054,25 @@
           <w:b/>
           <w:sz w:val="24"/>
         </w:rPr>
-        <w:t>Nomes dos alunos 2 a 5</w:t>
+        <w:t>Confirmar com a professora se CC pode entregar um jogo.</w:t>
       </w:r>
       <w:r>
         <w:rPr>
           <w:sz w:val="24"/>
         </w:rPr>
-        <w:t xml:space="preserve"> — hoje estão como </w:t>
-      </w:r>
-      <w:r>
-        <w:rPr>
-          <w:rFonts w:ascii="Consolas" w:hAnsi="Consolas"/>
-          <w:sz w:val="21"/>
-        </w:rPr>
-        <w:t>[NOME DO ALUNO n]</w:t>
-      </w:r>
-      <w:r>
-        <w:rPr>
-          <w:sz w:val="24"/>
-        </w:rPr>
-        <w:t xml:space="preserve"> na Proposta e na capa.</w:t>
+        <w:t xml:space="preserve"> O template separa a descrição</w:t>
       </w:r>
     </w:p>
     <w:p>
       <w:pPr>
-        <w:pStyle w:val="ListBullet"/>
-        <w:spacing w:after="0"/>
-      </w:pPr>
-      <w:r>
-        <w:rPr>
-          <w:b/>
+        <w:spacing w:after="120"/>
+        <w:jc w:val="both"/>
+      </w:pPr>
+      <w:r>
+        <w:rPr>
           <w:sz w:val="24"/>
         </w:rPr>
-        <w:t>Curso</w:t>
-      </w:r>
-      <w:r>
-        <w:rPr>
-          <w:sz w:val="24"/>
-        </w:rPr>
-        <w:t xml:space="preserve"> — a capa diz "SISTEMAS DE INFORMAÇÃO". Trocar se for Jogos Digitais / CC / TADS.</w:t>
+        <w:t>do mini-mundo em "Para alunos de SI/TADS/CC" (descrever a área de negócio) e "Para os alunos de Jogos" (descrever o roteiro do jogo). Como o curso é Ciência da Computação, a proposta usa a linha de SI/TADS/CC, e o texto do mini-mundo descreve o funcionamento do domínio — serve para as duas leituras. Ainda assim, vale perguntar antes de seguir.</w:t>
       </w:r>
     </w:p>
     <w:p>
@@ -15466,6 +15394,343 @@
           <w:sz w:val="24"/>
         </w:rPr>
         <w:t>e Ambler. Se a professora pedir seção de referências, montar a partir desses.</w:t>
+      </w:r>
+    </w:p>
+    <w:p>
+      <w:pPr>
+        <w:pStyle w:val="Heading2"/>
+      </w:pPr>
+      <w:r>
+        <w:rPr>
+          <w:rFonts w:ascii="Times New Roman" w:hAnsi="Times New Roman"/>
+          <w:b/>
+          <w:color w:val="000000"/>
+          <w:sz w:val="28"/>
+        </w:rPr>
+        <w:t>Onde o protótipo diverge da especificação</w:t>
+      </w:r>
+    </w:p>
+    <w:p>
+      <w:pPr>
+        <w:spacing w:after="120"/>
+        <w:jc w:val="both"/>
+      </w:pPr>
+      <w:r>
+        <w:rPr>
+          <w:sz w:val="24"/>
+        </w:rPr>
+        <w:t>Registrado aqui para você citar na defesa, ou alinhar depois:</w:t>
+      </w:r>
+    </w:p>
+    <w:p>
+      <w:pPr>
+        <w:pStyle w:val="ListBullet"/>
+        <w:spacing w:after="0"/>
+      </w:pPr>
+      <w:r>
+        <w:rPr>
+          <w:b/>
+          <w:sz w:val="24"/>
+        </w:rPr>
+        <w:t>`LadoPartida`</w:t>
+      </w:r>
+      <w:r>
+        <w:rPr>
+          <w:sz w:val="24"/>
+        </w:rPr>
+        <w:t xml:space="preserve"> — classe que não está no Diagrama de Classes do CDP. Guarda o estado de um</w:t>
+      </w:r>
+    </w:p>
+    <w:p>
+      <w:pPr>
+        <w:spacing w:after="120"/>
+        <w:jc w:val="both"/>
+      </w:pPr>
+      <w:r>
+        <w:rPr>
+          <w:sz w:val="24"/>
+        </w:rPr>
+        <w:t xml:space="preserve">jogador </w:t>
+      </w:r>
+      <w:r>
+        <w:rPr>
+          <w:i/>
+          <w:sz w:val="24"/>
+        </w:rPr>
+        <w:t>durante</w:t>
+      </w:r>
+      <w:r>
+        <w:rPr>
+          <w:sz w:val="24"/>
+        </w:rPr>
+        <w:t xml:space="preserve"> a partida (pontos de vida, mão, campo, monte). Na especificação esse estado está implícito em </w:t>
+      </w:r>
+      <w:r>
+        <w:rPr>
+          <w:rFonts w:ascii="Consolas" w:hAnsi="Consolas"/>
+          <w:sz w:val="21"/>
+        </w:rPr>
+        <w:t>Partida</w:t>
+      </w:r>
+      <w:r>
+        <w:rPr>
+          <w:sz w:val="24"/>
+        </w:rPr>
+        <w:t>; no código precisou virar classe. Vale acrescentar ao diagrama.</w:t>
+      </w:r>
+    </w:p>
+    <w:p>
+      <w:pPr>
+        <w:pStyle w:val="ListBullet"/>
+        <w:spacing w:after="0"/>
+      </w:pPr>
+      <w:r>
+        <w:rPr>
+          <w:b/>
+          <w:sz w:val="24"/>
+        </w:rPr>
+        <w:t>Persistência em memória</w:t>
+      </w:r>
+      <w:r>
+        <w:rPr>
+          <w:sz w:val="24"/>
+        </w:rPr>
+        <w:t xml:space="preserve"> — </w:t>
+      </w:r>
+      <w:r>
+        <w:rPr>
+          <w:rFonts w:ascii="Consolas" w:hAnsi="Consolas"/>
+          <w:sz w:val="21"/>
+        </w:rPr>
+        <w:t>RepositorioMemoria</w:t>
+      </w:r>
+      <w:r>
+        <w:rPr>
+          <w:sz w:val="24"/>
+        </w:rPr>
+        <w:t xml:space="preserve"> no lugar dos DAOs JDBC da seção 7.3. As</w:t>
+      </w:r>
+    </w:p>
+    <w:p>
+      <w:pPr>
+        <w:spacing w:after="120"/>
+        <w:jc w:val="both"/>
+      </w:pPr>
+      <w:r>
+        <w:rPr>
+          <w:sz w:val="24"/>
+        </w:rPr>
+        <w:t>interfaces já têm a forma do CGD projetado, então a troca não mexe no Model nem no Controller.</w:t>
+      </w:r>
+    </w:p>
+    <w:p>
+      <w:pPr>
+        <w:pStyle w:val="ListBullet"/>
+        <w:spacing w:after="0"/>
+      </w:pPr>
+      <w:r>
+        <w:rPr>
+          <w:b/>
+          <w:sz w:val="24"/>
+        </w:rPr>
+        <w:t>Cadastros básicos como `enum`</w:t>
+      </w:r>
+      <w:r>
+        <w:rPr>
+          <w:sz w:val="24"/>
+        </w:rPr>
+        <w:t xml:space="preserve"> — </w:t>
+      </w:r>
+      <w:r>
+        <w:rPr>
+          <w:rFonts w:ascii="Consolas" w:hAnsi="Consolas"/>
+          <w:sz w:val="21"/>
+        </w:rPr>
+        <w:t>Raridade</w:t>
+      </w:r>
+      <w:r>
+        <w:rPr>
+          <w:sz w:val="24"/>
+        </w:rPr>
+        <w:t xml:space="preserve">, </w:t>
+      </w:r>
+      <w:r>
+        <w:rPr>
+          <w:rFonts w:ascii="Consolas" w:hAnsi="Consolas"/>
+          <w:sz w:val="21"/>
+        </w:rPr>
+        <w:t>Elemento</w:t>
+      </w:r>
+      <w:r>
+        <w:rPr>
+          <w:sz w:val="24"/>
+        </w:rPr>
+        <w:t xml:space="preserve">, </w:t>
+      </w:r>
+      <w:r>
+        <w:rPr>
+          <w:rFonts w:ascii="Consolas" w:hAnsi="Consolas"/>
+          <w:sz w:val="21"/>
+        </w:rPr>
+        <w:t>Formato</w:t>
+      </w:r>
+      <w:r>
+        <w:rPr>
+          <w:sz w:val="24"/>
+        </w:rPr>
+        <w:t xml:space="preserve">, </w:t>
+      </w:r>
+      <w:r>
+        <w:rPr>
+          <w:rFonts w:ascii="Consolas" w:hAnsi="Consolas"/>
+          <w:sz w:val="21"/>
+        </w:rPr>
+        <w:t>StatusPartida</w:t>
+      </w:r>
+      <w:r>
+        <w:rPr>
+          <w:sz w:val="24"/>
+        </w:rPr>
+        <w:t>,</w:t>
+      </w:r>
+    </w:p>
+    <w:p>
+      <w:pPr>
+        <w:spacing w:after="120"/>
+        <w:jc w:val="both"/>
+      </w:pPr>
+      <w:r>
+        <w:rPr>
+          <w:rFonts w:ascii="Consolas" w:hAnsi="Consolas"/>
+          <w:sz w:val="21"/>
+        </w:rPr>
+        <w:t>ModoPartida</w:t>
+      </w:r>
+      <w:r>
+        <w:rPr>
+          <w:sz w:val="24"/>
+        </w:rPr>
+        <w:t xml:space="preserve"> e </w:t>
+      </w:r>
+      <w:r>
+        <w:rPr>
+          <w:rFonts w:ascii="Consolas" w:hAnsi="Consolas"/>
+          <w:sz w:val="21"/>
+        </w:rPr>
+        <w:t>TipoJogada</w:t>
+      </w:r>
+      <w:r>
+        <w:rPr>
+          <w:sz w:val="24"/>
+        </w:rPr>
+        <w:t xml:space="preserve"> estão como enum em vez de classes de cadastro. Em Java enum é classe, mas isso tira do administrador a possibilidade de manter esses dados sem recompilar, que é o que a seção 2.3 promete.</w:t>
+      </w:r>
+    </w:p>
+    <w:p>
+      <w:pPr>
+        <w:pStyle w:val="ListBullet"/>
+        <w:spacing w:after="0"/>
+      </w:pPr>
+      <w:r>
+        <w:rPr>
+          <w:b/>
+          <w:sz w:val="24"/>
+        </w:rPr>
+        <w:t>Formatos</w:t>
+      </w:r>
+      <w:r>
+        <w:rPr>
+          <w:sz w:val="24"/>
+        </w:rPr>
+        <w:t xml:space="preserve"> — </w:t>
+      </w:r>
+      <w:r>
+        <w:rPr>
+          <w:rFonts w:ascii="Consolas" w:hAnsi="Consolas"/>
+          <w:sz w:val="21"/>
+        </w:rPr>
+        <w:t>PADRAO</w:t>
+      </w:r>
+      <w:r>
+        <w:rPr>
+          <w:sz w:val="24"/>
+        </w:rPr>
+        <w:t xml:space="preserve"> está com 60 a 250 cartas e 3 cópias; </w:t>
+      </w:r>
+      <w:r>
+        <w:rPr>
+          <w:rFonts w:ascii="Consolas" w:hAnsi="Consolas"/>
+          <w:sz w:val="21"/>
+        </w:rPr>
+        <w:t>RAPIDO</w:t>
+      </w:r>
+      <w:r>
+        <w:rPr>
+          <w:sz w:val="24"/>
+        </w:rPr>
+        <w:t xml:space="preserve"> com 20 a 40 e 2 cópias.</w:t>
+      </w:r>
+    </w:p>
+    <w:p>
+      <w:pPr>
+        <w:spacing w:after="120"/>
+        <w:jc w:val="both"/>
+      </w:pPr>
+      <w:r>
+        <w:rPr>
+          <w:sz w:val="24"/>
+        </w:rPr>
+        <w:t>Números arbitrados, ajustar se o grupo quiser outro balanceamento.</w:t>
+      </w:r>
+    </w:p>
+    <w:p>
+      <w:pPr>
+        <w:pStyle w:val="ListBullet"/>
+        <w:spacing w:after="0"/>
+      </w:pPr>
+      <w:r>
+        <w:rPr>
+          <w:b/>
+          <w:sz w:val="24"/>
+        </w:rPr>
+        <w:t>Combate simplificado</w:t>
+      </w:r>
+      <w:r>
+        <w:rPr>
+          <w:sz w:val="24"/>
+        </w:rPr>
+        <w:t xml:space="preserve"> — o dano do lado atacante é somado e as criaturas defensoras absorvem</w:t>
+      </w:r>
+    </w:p>
+    <w:p>
+      <w:pPr>
+        <w:spacing w:after="120"/>
+        <w:jc w:val="both"/>
+      </w:pPr>
+      <w:r>
+        <w:rPr>
+          <w:sz w:val="24"/>
+        </w:rPr>
+        <w:t>na ordem em que estão no campo. Não há escolha de bloqueio nem de alvo pelo jogador.</w:t>
+      </w:r>
+    </w:p>
+    <w:p>
+      <w:pPr>
+        <w:pStyle w:val="ListBullet"/>
+        <w:spacing w:after="0"/>
+      </w:pPr>
+      <w:r>
+        <w:rPr>
+          <w:b/>
+          <w:sz w:val="24"/>
+        </w:rPr>
+        <w:t>Segurança, temporada e ranking</w:t>
+      </w:r>
+      <w:r>
+        <w:rPr>
+          <w:sz w:val="24"/>
+        </w:rPr>
+        <w:t xml:space="preserve"> — especificados nas seções 3, 7 e 8, mas fora do protótipo.</w:t>
       </w:r>
     </w:p>
     <w:sectPr>

</xml_diff>